<commit_message>
feat: Noite 8 refeita - Configurando o roteador (sai o planejamento da rede de casa)
O planejamento (planta, orçamento, medição de cabo) já foi trabalhado em outras
noites. A Noite 8 passa a ser a configuração completa do roteador, da caixa à
ficha de entrega. Noite 7 com a tarefa trocada (etiqueta do roteador de casa) e
referências às noites seguintes renumeradas; Plano Mensal 3 atualizado.

Co-Authored-By: Claude Opus 5.5 <noreply@anthropic.com>
Claude-Session: https://claude.ai/code/session_01WrXN2ywUtqvw4LjCuXr4xk
</commit_message>
<xml_diff>
--- a/Folha do Aluno - Redes 7 - Nomes na rede.docx
+++ b/Folha do Aluno - Redes 7 - Nomes na rede.docx
@@ -2350,7 +2350,7 @@
         <w:rPr>
           <w:sz w:val="22"/>
         </w:rPr>
-        <w:t>Numa folha à parte, desenhe a planta da sua casa à mão, vista de cima, com os cômodos</w:t>
+        <w:t>Anote a marca e o modelo do roteador de casa (etiqueta embaixo): ______________________________</w:t>
       </w:r>
     </w:p>
     <w:p>
@@ -2362,7 +2362,7 @@
         <w:rPr>
           <w:sz w:val="22"/>
         </w:rPr>
-        <w:t>Marque com X onde fica o modem/roteador e com uma seta por onde chega o cabo da internet</w:t>
+        <w:t>O nome do Wi-Fi da casa é igual ao da etiqueta?  ☐ Sim  ☐ Não     Alguém sabe a senha de administrador?  ☐ Sim  ☐ Não</w:t>
       </w:r>
     </w:p>
     <w:p>
@@ -2374,7 +2374,7 @@
         <w:rPr>
           <w:sz w:val="22"/>
         </w:rPr>
-        <w:t>Pinte os cômodos onde o Wi-Fi é fraco. Traga na Noite 8</w:t>
+        <w:t>Não tire foto da etiqueta nem mande a senha pra ninguém. Traga na Noite 8</w:t>
       </w:r>
     </w:p>
     <w:p/>

</xml_diff>